<commit_message>
Update handbook team authorship and proofreading acknowledgements
</commit_message>
<xml_diff>
--- a/notes/handbooks/reader_20261007/Chinese_SkillSpan_中文版编码手册_20261007.docx
+++ b/notes/handbooks/reader_20261007/Chinese_SkillSpan_中文版编码手册_20261007.docx
@@ -32,7 +32,7 @@
           <w:rFonts w:ascii="Times New Roman" w:hAnsi="Times New Roman" w:cs="Times New Roman"/>
           <w:lang w:eastAsia="zh-CN"/>
         </w:rPr>
-        <w:t xml:space="preserve">编写：李国静、郑彦镔、陈思妍、吴欣洋、周文霞、赵翔宇</w:t>
+        <w:t xml:space="preserve">编写：李国静等（Chinese-SkillSpan Benchmark 研究团队）</w:t>
       </w:r>
       <w:r>
         <w:rPr>
@@ -52,7 +52,7 @@
           <w:rFonts w:ascii="Times New Roman" w:hAnsi="Times New Roman" w:cs="Times New Roman"/>
           <w:lang w:eastAsia="zh-CN"/>
         </w:rPr>
-        <w:t xml:space="preserve">规则底稿：B.sop_v4.2.14（2026-09-09）｜文档修订：2026-10-07｜中文整理版</w:t>
+        <w:t xml:space="preserve">规则底稿：B.sop_v4.2.14（2026-09-09）｜文档修订：2026-10-08｜中文整理版</w:t>
       </w:r>
       <w:r>
         <w:rPr>
@@ -53887,6 +53887,20 @@
         <w:t>21. [ESCO-TG] ESCO expert group. Report of the expert group on transversal skills and competences, §5.3. https://esco.ec.europa.eu/system/files/2022-05/MSWG%2014-04%20Report%20of%20the%20expert%20group%20on%20transversal%20skills%20and%20competences.pdf</w:t>
       </w:r>
       <w:bookmarkEnd w:id="204"/>
+    </w:p>
+    <w:p>
+      <w:pPr>
+        <w:pStyle w:val="3"/>
+        <w:keepNext/>
+      </w:pPr>
+      <w:r>
+        <w:t>致谢</w:t>
+      </w:r>
+    </w:p>
+    <w:p>
+      <w:r>
+        <w:t>感谢陈思妍和郑彦镔为本手册所做的文字校对工作。</w:t>
+      </w:r>
     </w:p>
     <w:sectPr>
       <w:footerReference r:id="rId7" w:type="default"/>

</xml_diff>

<commit_message>
Correct bilingual handbook references and unify bibliography formatting
</commit_message>
<xml_diff>
--- a/notes/handbooks/reader_20261007/Chinese_SkillSpan_中文版编码手册_20261007.docx
+++ b/notes/handbooks/reader_20261007/Chinese_SkillSpan_中文版编码手册_20261007.docx
@@ -11541,10 +11541,7 @@
         </w:rPr>
       </w:pPr>
       <w:r>
-        <w:rPr>
-          <w:lang w:eastAsia="zh-CN"/>
-        </w:rPr>
-        <w:t>学习意愿的概念参照见ESCO专家组报告§5.3 (https://esco.ec.europa.eu/system/files/2022-05/MSWG%2014-04%20Report%20of%20the%20expert%20group%20on%20transversal%20skills%20and%20competences.pdf)。中文“意愿”跨度保留是本项目的标注决定，不是该报告逐字规则。 [ESCO-TG]</w:t>
+        <w:t xml:space="preserve">学习意愿的概念参照见ESCO专家组报告第5.3节。中文“意愿”跨度的保留是本项目的标注决定，不是该报告的逐字规则。[ESCO-T]</w:t>
       </w:r>
     </w:p>
     <w:p>
@@ -52308,7 +52305,7 @@
         <w:rPr>
           <w:woUserID w:val="1"/>
         </w:rPr>
-        <w:t xml:space="preserve">案例127‘测试理念’标T，表示本句中的测试工作意识与态度；其他实体保持不变。</w:t>
+        <w:t xml:space="preserve">案例127“测试理念”标T，表示本句中的测试工作意识与态度；其他实体保持不变。</w:t>
       </w:r>
       <w:r/>
     </w:p>
@@ -53201,242 +53198,372 @@
         </w:rPr>
       </w:pPr>
       <w:r>
-        <w:rPr/>
-        <w:t xml:space="preserve">文献标记与以下条目对应。[本项目规则]表示本项目制定的中文标注规则，不是外部文献。文献提供概念、任务设计或标注方法参照；中文例子的具体边界与最终标签，除明确说明外均由本项目确定。</w:t>
-      </w:r>
-      <w:r/>
-    </w:p>
-    <w:p>
-      <w:pPr>
-        <w:rPr>
-          <w:rFonts w:ascii="Times New Roman" w:hAnsi="Times New Roman" w:cs="Times New Roman"/>
-        </w:rPr>
+        <w:rPr>
+          <w:rFonts w:ascii="Times New Roman" w:hAnsi="Times New Roman" w:eastAsia="宋体"/>
+          <w:sz w:val="22"/>
+          <w:color w:val="000000"/>
+        </w:rPr>
+        <w:t xml:space="preserve">文中的文献标记对应以下条目。[本项目规则]表示研究团队制定的标注规则，并非外部文献。除另有说明，中文例子的标注边界和标签均按本手册确定。</w:t>
+      </w:r>
+    </w:p>
+    <w:p>
+      <w:pPr>
+        <w:spacing w:before="0" w:after="120" w:line="276" w:lineRule="auto"/>
       </w:pPr>
       <w:bookmarkStart w:id="184" w:name="ref_ESCO14"/>
       <w:r>
         <w:rPr>
-          <w:rFonts w:ascii="Times New Roman" w:hAnsi="Times New Roman" w:cs="Times New Roman"/>
-          <w:lang w:eastAsia="zh-CN"/>
-        </w:rPr>
-        <w:t xml:space="preserve">1. </w:t>
-      </w:r>
-      <w:r>
-        <w:rPr>
-          <w:rFonts w:ascii="Times New Roman" w:hAnsi="Times New Roman" w:cs="Times New Roman"/>
+          <w:rFonts w:ascii="Times New Roman" w:hAnsi="Times New Roman" w:eastAsia="宋体"/>
+          <w:sz w:val="22"/>
           <w:b/>
-          <w:lang w:eastAsia="zh-CN"/>
-        </w:rPr>
-        <w:t>[ESCO14]</w:t>
-      </w:r>
-      <w:r>
-        <w:rPr>
-          <w:rFonts w:ascii="Times New Roman" w:hAnsi="Times New Roman" w:cs="Times New Roman"/>
-          <w:lang w:eastAsia="zh-CN"/>
-        </w:rPr>
-        <w:t xml:space="preserve"> le Vrang, M., Papantoniou, A., Pauwels, E., Fannes, P., Vandensteen, D., and De Smedt, J. 2014. </w:t>
-      </w:r>
-      <w:r>
-        <w:rPr>
-          <w:rFonts w:ascii="Times New Roman" w:hAnsi="Times New Roman" w:cs="Times New Roman"/>
-        </w:rPr>
-        <w:t xml:space="preserve">ESCO: Boosting job matching in Europe with semantic interoperability. </w:t>
-      </w:r>
-      <w:r>
-        <w:rPr>
-          <w:rFonts w:ascii="Times New Roman" w:hAnsi="Times New Roman" w:cs="Times New Roman"/>
-          <w:i/>
-        </w:rPr>
-        <w:t>Computer</w:t>
-      </w:r>
-      <w:r>
-        <w:rPr>
-          <w:rFonts w:ascii="Times New Roman" w:hAnsi="Times New Roman" w:cs="Times New Roman"/>
-        </w:rPr>
-        <w:t xml:space="preserve"> 47(10):57–64. DOI: 10.1109/MC.2014.283. 门户：skill_main (https://esco.ec.europa.eu/en/classification/skill_main)；Skills pillar (https://esco.ec.europa.eu/en/about-esco/escopedia/escopedia/skills-pillar)；Knowledge (https://esco.ec.europa.eu/en/about-esco/escopedia/escopedia/knowledge)；Skill (https://esco.ec.europa.eu/en/about-esco/escopedia/escopedia/skill)。</w:t>
+          <w:color w:val="000000"/>
+        </w:rPr>
+        <w:t xml:space="preserve">1. [ESCO14]</w:t>
+      </w:r>
+      <w:r>
+        <w:rPr>
+          <w:rFonts w:ascii="Times New Roman" w:hAnsi="Times New Roman" w:eastAsia="宋体"/>
+          <w:sz w:val="22"/>
+          <w:color w:val="000000"/>
+        </w:rPr>
+        <w:t xml:space="preserve"> le Vrang, M., Papantoniou, A., Pauwels, E., Fannes, P., Vandensteen, D., and De Smedt, J. 2014. ESCO: Boosting job matching in Europe with semantic interoperability. Computer 47(10):57–64. DOI: 10.1109/MC.2014.283. 门户：skill_main (</w:t>
+      </w:r>
+      <w:hyperlink r:id="rId3">
+        <w:r>
+          <w:rPr>
+            <w:rFonts w:ascii="Times New Roman" w:hAnsi="Times New Roman" w:eastAsia="宋体"/>
+            <w:sz w:val="22"/>
+            <w:color w:val="0563C1"/>
+            <w:u w:val="single"/>
+          </w:rPr>
+          <w:t xml:space="preserve">https://esco.ec.europa.eu/en/classification/skill_main</w:t>
+        </w:r>
+      </w:hyperlink>
+      <w:r>
+        <w:rPr>
+          <w:rFonts w:ascii="Times New Roman" w:hAnsi="Times New Roman" w:eastAsia="宋体"/>
+          <w:sz w:val="22"/>
+          <w:color w:val="000000"/>
+        </w:rPr>
+        <w:t xml:space="preserve">)</w:t>
+      </w:r>
+      <w:r>
+        <w:rPr>
+          <w:rFonts w:ascii="Times New Roman" w:hAnsi="Times New Roman" w:eastAsia="宋体"/>
+          <w:sz w:val="22"/>
+          <w:color w:val="000000"/>
+        </w:rPr>
+        <w:t xml:space="preserve">；Skills pillar (</w:t>
+      </w:r>
+      <w:hyperlink r:id="rId4">
+        <w:r>
+          <w:rPr>
+            <w:rFonts w:ascii="Times New Roman" w:hAnsi="Times New Roman" w:eastAsia="宋体"/>
+            <w:sz w:val="22"/>
+            <w:color w:val="0563C1"/>
+            <w:u w:val="single"/>
+          </w:rPr>
+          <w:t xml:space="preserve">https://esco.ec.europa.eu/en/about-esco/escopedia/escopedia/skills-pillar</w:t>
+        </w:r>
+      </w:hyperlink>
+      <w:r>
+        <w:rPr>
+          <w:rFonts w:ascii="Times New Roman" w:hAnsi="Times New Roman" w:eastAsia="宋体"/>
+          <w:sz w:val="22"/>
+          <w:color w:val="000000"/>
+        </w:rPr>
+        <w:t xml:space="preserve">)</w:t>
+      </w:r>
+      <w:r>
+        <w:rPr>
+          <w:rFonts w:ascii="Times New Roman" w:hAnsi="Times New Roman" w:eastAsia="宋体"/>
+          <w:sz w:val="22"/>
+          <w:color w:val="000000"/>
+        </w:rPr>
+        <w:t xml:space="preserve">；Knowledge (</w:t>
+      </w:r>
+      <w:hyperlink r:id="rId12">
+        <w:r>
+          <w:rPr>
+            <w:rFonts w:ascii="Times New Roman" w:hAnsi="Times New Roman" w:eastAsia="宋体"/>
+            <w:sz w:val="22"/>
+            <w:color w:val="0563C1"/>
+            <w:u w:val="single"/>
+          </w:rPr>
+          <w:t xml:space="preserve">https://esco.ec.europa.eu/en/about-esco/escopedia/escopedia/knowledge</w:t>
+        </w:r>
+      </w:hyperlink>
+      <w:r>
+        <w:rPr>
+          <w:rFonts w:ascii="Times New Roman" w:hAnsi="Times New Roman" w:eastAsia="宋体"/>
+          <w:sz w:val="22"/>
+          <w:color w:val="000000"/>
+        </w:rPr>
+        <w:t xml:space="preserve">)</w:t>
+      </w:r>
+      <w:r>
+        <w:rPr>
+          <w:rFonts w:ascii="Times New Roman" w:hAnsi="Times New Roman" w:eastAsia="宋体"/>
+          <w:sz w:val="22"/>
+          <w:color w:val="000000"/>
+        </w:rPr>
+        <w:t xml:space="preserve">；Skill (</w:t>
+      </w:r>
+      <w:hyperlink r:id="rId13">
+        <w:r>
+          <w:rPr>
+            <w:rFonts w:ascii="Times New Roman" w:hAnsi="Times New Roman" w:eastAsia="宋体"/>
+            <w:sz w:val="22"/>
+            <w:color w:val="0563C1"/>
+            <w:u w:val="single"/>
+          </w:rPr>
+          <w:t xml:space="preserve">https://esco.ec.europa.eu/en/about-esco/escopedia/escopedia/skill</w:t>
+        </w:r>
+      </w:hyperlink>
+      <w:r>
+        <w:rPr>
+          <w:rFonts w:ascii="Times New Roman" w:hAnsi="Times New Roman" w:eastAsia="宋体"/>
+          <w:sz w:val="22"/>
+          <w:color w:val="000000"/>
+        </w:rPr>
+        <w:t xml:space="preserve">)</w:t>
+      </w:r>
+      <w:r>
+        <w:rPr>
+          <w:rFonts w:ascii="Times New Roman" w:hAnsi="Times New Roman" w:eastAsia="宋体"/>
+          <w:sz w:val="22"/>
+          <w:color w:val="000000"/>
+        </w:rPr>
+        <w:t xml:space="preserve">。</w:t>
       </w:r>
       <w:bookmarkEnd w:id="184"/>
     </w:p>
     <w:p>
       <w:pPr>
-        <w:rPr>
-          <w:rFonts w:ascii="Times New Roman" w:hAnsi="Times New Roman" w:cs="Times New Roman"/>
-        </w:rPr>
+        <w:spacing w:before="0" w:after="120" w:line="276" w:lineRule="auto"/>
       </w:pPr>
       <w:bookmarkStart w:id="185" w:name="ref_EQF"/>
       <w:r>
         <w:rPr>
-          <w:rFonts w:ascii="Times New Roman" w:hAnsi="Times New Roman" w:cs="Times New Roman"/>
-        </w:rPr>
-        <w:t xml:space="preserve">2. [EQF] Council of the European Union. 2017. Council Recommendation of 22 May 2017 on the European Qualifications Framework for lifelong learning (2017/C 189/03). Official Journal of the European Union C 189:15–28. </w:t>
-      </w:r>
-      <w:r>
-        <w:fldChar w:fldCharType="begin"/>
-      </w:r>
-      <w:r>
-        <w:instrText xml:space="preserve"> HYPERLINK "https://eur-lex.europa.eu/legal-content/EN/TXT/?uri=CELEX%3A32017H0615%2801%29" \h </w:instrText>
-      </w:r>
-      <w:r>
-        <w:fldChar w:fldCharType="separate"/>
-      </w:r>
-      <w:r>
-        <w:rPr>
-          <w:rFonts w:ascii="Times New Roman" w:hAnsi="Times New Roman" w:cs="Times New Roman"/>
-        </w:rPr>
-        <w:t>https://eur-lex.europa.eu/legal-content/EN/TXT/?uri=CELEX%3A32017H0615%2801%29</w:t>
-      </w:r>
-      <w:r>
-        <w:rPr>
-          <w:rFonts w:ascii="Times New Roman" w:hAnsi="Times New Roman" w:cs="Times New Roman"/>
-        </w:rPr>
-        <w:fldChar w:fldCharType="end"/>
-      </w:r>
+          <w:rFonts w:ascii="Times New Roman" w:hAnsi="Times New Roman" w:eastAsia="宋体"/>
+          <w:sz w:val="22"/>
+          <w:b/>
+          <w:color w:val="000000"/>
+        </w:rPr>
+        <w:t xml:space="preserve">2. [EQF]</w:t>
+      </w:r>
+      <w:r>
+        <w:rPr>
+          <w:rFonts w:ascii="Times New Roman" w:hAnsi="Times New Roman" w:eastAsia="宋体"/>
+          <w:sz w:val="22"/>
+          <w:color w:val="000000"/>
+        </w:rPr>
+        <w:t xml:space="preserve"> Council of the European Union. 2017. Council Recommendation of 22 May 2017 on the European Qualifications Framework for lifelong learning (2017/C 189/03). Official Journal of the European Union C 189:15–28. </w:t>
+      </w:r>
+      <w:hyperlink r:id="rId14">
+        <w:r>
+          <w:rPr>
+            <w:rFonts w:ascii="Times New Roman" w:hAnsi="Times New Roman" w:eastAsia="宋体"/>
+            <w:sz w:val="22"/>
+            <w:color w:val="0563C1"/>
+            <w:u w:val="single"/>
+          </w:rPr>
+          <w:t xml:space="preserve">https://eur-lex.europa.eu/legal-content/EN/TXT/?uri=CELEX%3A32017H0615%2801%29</w:t>
+        </w:r>
+      </w:hyperlink>
       <w:bookmarkEnd w:id="185"/>
     </w:p>
     <w:p>
       <w:pPr>
-        <w:rPr>
-          <w:rFonts w:ascii="Times New Roman" w:hAnsi="Times New Roman" w:cs="Times New Roman"/>
-        </w:rPr>
+        <w:spacing w:before="0" w:after="120" w:line="276" w:lineRule="auto"/>
       </w:pPr>
       <w:bookmarkStart w:id="186" w:name="ref_ESCO_L"/>
       <w:r>
         <w:rPr>
-          <w:rFonts w:ascii="Times New Roman" w:hAnsi="Times New Roman" w:cs="Times New Roman"/>
-        </w:rPr>
-        <w:t xml:space="preserve">3. </w:t>
-      </w:r>
-      <w:r>
-        <w:rPr>
-          <w:rFonts w:ascii="Times New Roman" w:hAnsi="Times New Roman" w:cs="Times New Roman"/>
+          <w:rFonts w:ascii="Times New Roman" w:hAnsi="Times New Roman" w:eastAsia="宋体"/>
+          <w:sz w:val="22"/>
           <w:b/>
-        </w:rPr>
-        <w:t>[ESCO-L]</w:t>
-      </w:r>
-      <w:r>
-        <w:rPr>
-          <w:rFonts w:ascii="Times New Roman" w:hAnsi="Times New Roman" w:cs="Times New Roman"/>
-        </w:rPr>
-        <w:t xml:space="preserve"> European Commission. ESCO skills pillar, class </w:t>
-      </w:r>
-      <w:r>
-        <w:rPr>
-          <w:rFonts w:ascii="Times New Roman" w:hAnsi="Times New Roman" w:cs="Times New Roman"/>
-          <w:i/>
-        </w:rPr>
-        <w:t>Language skills and knowledge</w:t>
-      </w:r>
-      <w:r>
-        <w:rPr>
-          <w:rFonts w:ascii="Times New Roman" w:hAnsi="Times New Roman" w:cs="Times New Roman"/>
-        </w:rPr>
-        <w:t xml:space="preserve"> (hierarchy letter L). https://esco.ec.europa.eu/en/classification/skill_main ；https://esco.ec.europa.eu/en/about-esco/escopedia/escopedia/skills-pillar</w:t>
-      </w:r>
+          <w:color w:val="000000"/>
+        </w:rPr>
+        <w:t xml:space="preserve">3. [ESCO-L]</w:t>
+      </w:r>
+      <w:r>
+        <w:rPr>
+          <w:rFonts w:ascii="Times New Roman" w:hAnsi="Times New Roman" w:eastAsia="宋体"/>
+          <w:sz w:val="22"/>
+          <w:color w:val="000000"/>
+        </w:rPr>
+        <w:t xml:space="preserve"> European Commission. ESCO skills pillar, class Language skills and knowledge (hierarchy letter L). </w:t>
+      </w:r>
+      <w:hyperlink r:id="rId3">
+        <w:r>
+          <w:rPr>
+            <w:rFonts w:ascii="Times New Roman" w:hAnsi="Times New Roman" w:eastAsia="宋体"/>
+            <w:sz w:val="22"/>
+            <w:color w:val="0563C1"/>
+            <w:u w:val="single"/>
+          </w:rPr>
+          <w:t xml:space="preserve">https://esco.ec.europa.eu/en/classification/skill_main</w:t>
+        </w:r>
+      </w:hyperlink>
+      <w:r>
+        <w:rPr>
+          <w:rFonts w:ascii="Times New Roman" w:hAnsi="Times New Roman" w:eastAsia="宋体"/>
+          <w:sz w:val="22"/>
+          <w:color w:val="000000"/>
+        </w:rPr>
+        <w:t xml:space="preserve"> ；</w:t>
+      </w:r>
+      <w:hyperlink r:id="rId4">
+        <w:r>
+          <w:rPr>
+            <w:rFonts w:ascii="Times New Roman" w:hAnsi="Times New Roman" w:eastAsia="宋体"/>
+            <w:sz w:val="22"/>
+            <w:color w:val="0563C1"/>
+            <w:u w:val="single"/>
+          </w:rPr>
+          <w:t xml:space="preserve">https://esco.ec.europa.eu/en/about-esco/escopedia/escopedia/skills-pillar</w:t>
+        </w:r>
+      </w:hyperlink>
       <w:bookmarkEnd w:id="186"/>
     </w:p>
     <w:p>
       <w:pPr>
-        <w:rPr>
-          <w:rFonts w:ascii="Times New Roman" w:hAnsi="Times New Roman" w:cs="Times New Roman"/>
-        </w:rPr>
+        <w:spacing w:before="0" w:after="120" w:line="276" w:lineRule="auto"/>
       </w:pPr>
       <w:bookmarkStart w:id="187" w:name="ref_ESCO_T"/>
       <w:r>
         <w:rPr>
-          <w:rFonts w:ascii="Times New Roman" w:hAnsi="Times New Roman" w:cs="Times New Roman"/>
-        </w:rPr>
-        <w:t xml:space="preserve">4. </w:t>
-      </w:r>
-      <w:r>
-        <w:rPr>
-          <w:rFonts w:ascii="Times New Roman" w:hAnsi="Times New Roman" w:cs="Times New Roman"/>
+          <w:rFonts w:ascii="Times New Roman" w:hAnsi="Times New Roman" w:eastAsia="宋体"/>
+          <w:sz w:val="22"/>
           <w:b/>
-        </w:rPr>
-        <w:t>[ESCO-T]</w:t>
-      </w:r>
-      <w:r>
-        <w:rPr>
-          <w:rFonts w:ascii="Times New Roman" w:hAnsi="Times New Roman" w:cs="Times New Roman"/>
-        </w:rPr>
-        <w:t xml:space="preserve"> European Commission / Cedefop. 2022. </w:t>
-      </w:r>
-      <w:r>
-        <w:rPr>
-          <w:rFonts w:ascii="Times New Roman" w:hAnsi="Times New Roman" w:cs="Times New Roman"/>
-          <w:i/>
-        </w:rPr>
-        <w:t>Towards a structured and consistent terminology on transversal skills and competences.</w:t>
-      </w:r>
-      <w:r>
-        <w:rPr>
-          <w:rFonts w:ascii="Times New Roman" w:hAnsi="Times New Roman" w:cs="Times New Roman"/>
-        </w:rPr>
-        <w:t xml:space="preserve"> ESCO/EQF expert group final report. https://esco.ec.europa.eu/en/about-esco/publications/publication/towards-structured-and-consistent-terminology-transversal ；概念 report facts：http://data.europa.eu/esco/skill/be6ab363-3de1-427f-a8ef-85d5b0250822</w:t>
+          <w:color w:val="000000"/>
+        </w:rPr>
+        <w:t xml:space="preserve">4. [ESCO-T]</w:t>
+      </w:r>
+      <w:r>
+        <w:rPr>
+          <w:rFonts w:ascii="Times New Roman" w:hAnsi="Times New Roman" w:eastAsia="宋体"/>
+          <w:sz w:val="22"/>
+          <w:color w:val="000000"/>
+        </w:rPr>
+        <w:t xml:space="preserve"> Hart, J., Noack, M., Plaimauer, C., and Bjørnåvold, J. 2021. Towards a structured and consistent terminology on transversal skills and competences. 3rd report to the ESCO Member States Working Group, 2 June 2021. ESCO官网发布于2022年5月17日。</w:t>
+      </w:r>
+      <w:hyperlink r:id="rId15">
+        <w:r>
+          <w:rPr>
+            <w:rFonts w:ascii="Times New Roman" w:hAnsi="Times New Roman" w:eastAsia="宋体"/>
+            <w:sz w:val="22"/>
+            <w:color w:val="0563C1"/>
+            <w:u w:val="single"/>
+          </w:rPr>
+          <w:t xml:space="preserve">报告介绍与下载</w:t>
+        </w:r>
+      </w:hyperlink>
+      <w:r>
+        <w:rPr>
+          <w:rFonts w:ascii="Times New Roman" w:hAnsi="Times New Roman" w:eastAsia="宋体"/>
+          <w:sz w:val="22"/>
+          <w:color w:val="000000"/>
+        </w:rPr>
+        <w:t xml:space="preserve">；</w:t>
+      </w:r>
+      <w:hyperlink r:id="rId16">
+        <w:r>
+          <w:rPr>
+            <w:rFonts w:ascii="Times New Roman" w:hAnsi="Times New Roman" w:eastAsia="宋体"/>
+            <w:sz w:val="22"/>
+            <w:color w:val="0563C1"/>
+            <w:u w:val="single"/>
+          </w:rPr>
+          <w:t xml:space="preserve">概念 report facts</w:t>
+        </w:r>
+      </w:hyperlink>
+      <w:r>
+        <w:rPr>
+          <w:rFonts w:ascii="Times New Roman" w:hAnsi="Times New Roman" w:eastAsia="宋体"/>
+          <w:sz w:val="22"/>
+          <w:color w:val="000000"/>
+        </w:rPr>
+        <w:t xml:space="preserve">。</w:t>
       </w:r>
       <w:bookmarkEnd w:id="187"/>
-    </w:p>
-    <w:p>
+      <w:bookmarkStart w:id="204" w:name="ref_ESCO_TG"/>
+      <w:bookmarkEnd w:id="204"/>
+    </w:p>
+    <w:p>
+      <w:pPr>
+        <w:spacing w:before="0" w:after="120" w:line="276" w:lineRule="auto"/>
+      </w:pPr>
       <w:bookmarkStart w:id="188" w:name="ref_ESCO_Q"/>
       <w:r>
         <w:rPr>
-          <w:rFonts w:ascii="Times New Roman" w:hAnsi="Times New Roman" w:cs="Times New Roman"/>
-        </w:rPr>
-        <w:t xml:space="preserve">5. [ESCO-Q] European Commission. ESCO: Qualifications. </w:t>
-      </w:r>
-      <w:r>
-        <w:fldChar w:fldCharType="begin"/>
-      </w:r>
-      <w:r>
-        <w:instrText xml:space="preserve"> HYPERLINK "https://esco.ec.europa.eu/en/classification/qualifications" \h </w:instrText>
-      </w:r>
-      <w:r>
-        <w:fldChar w:fldCharType="separate"/>
-      </w:r>
-      <w:r>
-        <w:rPr>
-          <w:rFonts w:ascii="Times New Roman" w:hAnsi="Times New Roman" w:cs="Times New Roman"/>
-        </w:rPr>
-        <w:t>https://esco.ec.europa.eu/en/classification/qualifications</w:t>
-      </w:r>
-      <w:r>
-        <w:rPr>
-          <w:rFonts w:ascii="Times New Roman" w:hAnsi="Times New Roman" w:cs="Times New Roman"/>
-        </w:rPr>
-        <w:fldChar w:fldCharType="end"/>
-      </w:r>
+          <w:rFonts w:ascii="Times New Roman" w:hAnsi="Times New Roman" w:eastAsia="宋体"/>
+          <w:sz w:val="22"/>
+          <w:b/>
+          <w:color w:val="000000"/>
+        </w:rPr>
+        <w:t xml:space="preserve">5. [ESCO-Q]</w:t>
+      </w:r>
+      <w:r>
+        <w:rPr>
+          <w:rFonts w:ascii="Times New Roman" w:hAnsi="Times New Roman" w:eastAsia="宋体"/>
+          <w:sz w:val="22"/>
+          <w:color w:val="000000"/>
+        </w:rPr>
+        <w:t xml:space="preserve"> European Commission. ESCO: Qualifications. </w:t>
+      </w:r>
+      <w:hyperlink r:id="rId17">
+        <w:r>
+          <w:rPr>
+            <w:rFonts w:ascii="Times New Roman" w:hAnsi="Times New Roman" w:eastAsia="宋体"/>
+            <w:sz w:val="22"/>
+            <w:color w:val="0563C1"/>
+            <w:u w:val="single"/>
+          </w:rPr>
+          <w:t xml:space="preserve">https://esco.ec.europa.eu/en/classification/qualifications</w:t>
+        </w:r>
+      </w:hyperlink>
       <w:bookmarkEnd w:id="188"/>
     </w:p>
     <w:p>
+      <w:pPr>
+        <w:spacing w:before="0" w:after="120" w:line="276" w:lineRule="auto"/>
+      </w:pPr>
       <w:bookmarkStart w:id="189" w:name="ref_Z22"/>
       <w:r>
         <w:rPr>
-          <w:rFonts w:ascii="Times New Roman" w:hAnsi="Times New Roman" w:cs="Times New Roman"/>
-        </w:rPr>
-        <w:t xml:space="preserve">6. [Z22] Zhang, M., Jensen, K. N., Sonniks, S., and Plank, B. 2022. SkillSpan: Hard and Soft Skill Extraction from English Job Postings. In NAACL-HLT, 4962–4984. DOI: 10.18653/v1/2022.naacl-main.366. </w:t>
-      </w:r>
-      <w:r>
-        <w:fldChar w:fldCharType="begin"/>
-      </w:r>
-      <w:r>
-        <w:instrText xml:space="preserve"> HYPERLINK "https://aclanthology.org/2022.naacl-main.366/" \h </w:instrText>
-      </w:r>
-      <w:r>
-        <w:fldChar w:fldCharType="separate"/>
-      </w:r>
-      <w:r>
-        <w:rPr>
-          <w:rFonts w:ascii="Times New Roman" w:hAnsi="Times New Roman" w:cs="Times New Roman"/>
-        </w:rPr>
-        <w:t>https://aclanthology.org/2022.naacl-main.366/</w:t>
-      </w:r>
-      <w:r>
-        <w:rPr>
-          <w:rFonts w:ascii="Times New Roman" w:hAnsi="Times New Roman" w:cs="Times New Roman"/>
-        </w:rPr>
-        <w:fldChar w:fldCharType="end"/>
-      </w:r>
-      <w:r>
-        <w:rPr>
-          <w:rFonts w:ascii="Times New Roman" w:hAnsi="Times New Roman" w:cs="Times New Roman"/>
+          <w:rFonts w:ascii="Times New Roman" w:hAnsi="Times New Roman" w:eastAsia="宋体"/>
+          <w:sz w:val="22"/>
+          <w:b/>
+          <w:color w:val="000000"/>
+        </w:rPr>
+        <w:t xml:space="preserve">6. [Z22]</w:t>
+      </w:r>
+      <w:r>
+        <w:rPr>
+          <w:rFonts w:ascii="Times New Roman" w:hAnsi="Times New Roman" w:eastAsia="宋体"/>
+          <w:sz w:val="22"/>
+          <w:color w:val="000000"/>
+        </w:rPr>
+        <w:t xml:space="preserve"> Zhang, M., Jensen, K. N., Sonniks, S. D., and Plank, B. 2022. SkillSpan: Hard and Soft Skill Extraction from English Job Postings. In NAACL-HLT, 4962–4984. DOI: 10.18653/v1/2022.naacl-main.366. </w:t>
+      </w:r>
+      <w:hyperlink r:id="rId18">
+        <w:r>
+          <w:rPr>
+            <w:rFonts w:ascii="Times New Roman" w:hAnsi="Times New Roman" w:eastAsia="宋体"/>
+            <w:sz w:val="22"/>
+            <w:color w:val="0563C1"/>
+            <w:u w:val="single"/>
+          </w:rPr>
+          <w:t xml:space="preserve">https://aclanthology.org/2022.naacl-main.366/</w:t>
+        </w:r>
+      </w:hyperlink>
+      <w:r>
+        <w:rPr>
+          <w:rFonts w:ascii="Times New Roman" w:hAnsi="Times New Roman" w:eastAsia="宋体"/>
+          <w:sz w:val="22"/>
+          <w:color w:val="000000"/>
         </w:rPr>
         <w:t xml:space="preserve"> （标注指南见该论文附录B；学历例子见B.2第8条。）</w:t>
       </w:r>
@@ -53444,449 +53571,520 @@
     </w:p>
     <w:p>
       <w:pPr>
-        <w:rPr>
-          <w:rFonts w:ascii="Times New Roman" w:hAnsi="Times New Roman" w:cs="Times New Roman"/>
-        </w:rPr>
+        <w:spacing w:before="0" w:after="120" w:line="276" w:lineRule="auto"/>
       </w:pPr>
       <w:bookmarkStart w:id="190" w:name="ref_Say18"/>
       <w:r>
         <w:rPr>
-          <w:rFonts w:ascii="Times New Roman" w:hAnsi="Times New Roman" w:cs="Times New Roman"/>
-        </w:rPr>
-        <w:t xml:space="preserve">7. </w:t>
-      </w:r>
-      <w:r>
-        <w:rPr>
-          <w:rFonts w:ascii="Times New Roman" w:hAnsi="Times New Roman" w:cs="Times New Roman"/>
+          <w:rFonts w:ascii="Times New Roman" w:hAnsi="Times New Roman" w:eastAsia="宋体"/>
+          <w:sz w:val="22"/>
           <w:b/>
-        </w:rPr>
-        <w:t>[Say18]</w:t>
-      </w:r>
-      <w:r>
-        <w:rPr>
-          <w:rFonts w:ascii="Times New Roman" w:hAnsi="Times New Roman" w:cs="Times New Roman"/>
-        </w:rPr>
-        <w:t xml:space="preserve"> Sayfullina, L., Malmi, E., and Kannala, J. 2018. Learning Representations for Soft Skill Matching. In </w:t>
-      </w:r>
-      <w:r>
-        <w:rPr>
-          <w:rFonts w:ascii="Times New Roman" w:hAnsi="Times New Roman" w:cs="Times New Roman"/>
-          <w:i/>
-        </w:rPr>
-        <w:t>Analysis of Images, Social Networks and Texts</w:t>
-      </w:r>
-      <w:r>
-        <w:rPr>
-          <w:rFonts w:ascii="Times New Roman" w:hAnsi="Times New Roman" w:cs="Times New Roman"/>
-        </w:rPr>
-        <w:t xml:space="preserve"> (AIST 2018), LNCS 11179, 141–152. https://doi.org/10.1007/978-3-030-11027-7_15 ；arXiv:1807.07741.</w:t>
+          <w:color w:val="000000"/>
+        </w:rPr>
+        <w:t xml:space="preserve">7. [Say18]</w:t>
+      </w:r>
+      <w:r>
+        <w:rPr>
+          <w:rFonts w:ascii="Times New Roman" w:hAnsi="Times New Roman" w:eastAsia="宋体"/>
+          <w:sz w:val="22"/>
+          <w:color w:val="000000"/>
+        </w:rPr>
+        <w:t xml:space="preserve"> Sayfullina, L., Malmi, E., and Kannala, J. 2018. Learning Representations for Soft Skill Matching. In Analysis of Images, Social Networks and Texts (AIST 2018), LNCS 11179, 141–152. </w:t>
+      </w:r>
+      <w:hyperlink r:id="rId19">
+        <w:r>
+          <w:rPr>
+            <w:rFonts w:ascii="Times New Roman" w:hAnsi="Times New Roman" w:eastAsia="宋体"/>
+            <w:sz w:val="22"/>
+            <w:color w:val="0563C1"/>
+            <w:u w:val="single"/>
+          </w:rPr>
+          <w:t xml:space="preserve">https://doi.org/10.1007/978-3-030-11027-7_15</w:t>
+        </w:r>
+      </w:hyperlink>
+      <w:r>
+        <w:rPr>
+          <w:rFonts w:ascii="Times New Roman" w:hAnsi="Times New Roman" w:eastAsia="宋体"/>
+          <w:sz w:val="22"/>
+          <w:color w:val="000000"/>
+        </w:rPr>
+        <w:t xml:space="preserve"> ；arXiv:1807.07741.</w:t>
       </w:r>
       <w:bookmarkEnd w:id="190"/>
     </w:p>
     <w:p>
       <w:pPr>
-        <w:rPr>
-          <w:rFonts w:ascii="Times New Roman" w:hAnsi="Times New Roman" w:cs="Times New Roman"/>
-        </w:rPr>
+        <w:spacing w:before="0" w:after="120" w:line="276" w:lineRule="auto"/>
       </w:pPr>
       <w:bookmarkStart w:id="191" w:name="ref_AP08"/>
       <w:r>
         <w:rPr>
-          <w:rFonts w:ascii="Times New Roman" w:hAnsi="Times New Roman" w:cs="Times New Roman"/>
-        </w:rPr>
-        <w:t xml:space="preserve">8. </w:t>
-      </w:r>
-      <w:r>
-        <w:rPr>
-          <w:rFonts w:ascii="Times New Roman" w:hAnsi="Times New Roman" w:cs="Times New Roman"/>
+          <w:rFonts w:ascii="Times New Roman" w:hAnsi="Times New Roman" w:eastAsia="宋体"/>
+          <w:sz w:val="22"/>
           <w:b/>
-        </w:rPr>
-        <w:t>[AP08]</w:t>
-      </w:r>
-      <w:r>
-        <w:rPr>
-          <w:rFonts w:ascii="Times New Roman" w:hAnsi="Times New Roman" w:cs="Times New Roman"/>
-        </w:rPr>
-        <w:t xml:space="preserve"> Artstein, R., and Poesio, M. 2008. Inter-Coder Agreement for Computational Linguistics. </w:t>
-      </w:r>
-      <w:r>
-        <w:rPr>
-          <w:rFonts w:ascii="Times New Roman" w:hAnsi="Times New Roman" w:cs="Times New Roman"/>
-          <w:i/>
-        </w:rPr>
-        <w:t>Computational Linguistics</w:t>
-      </w:r>
-      <w:r>
-        <w:rPr>
-          <w:rFonts w:ascii="Times New Roman" w:hAnsi="Times New Roman" w:cs="Times New Roman"/>
-        </w:rPr>
-        <w:t xml:space="preserve"> 34(4):555–596. https://aclanthology.org/J08-4004/</w:t>
-      </w:r>
+          <w:color w:val="000000"/>
+        </w:rPr>
+        <w:t xml:space="preserve">8. [AP08]</w:t>
+      </w:r>
+      <w:r>
+        <w:rPr>
+          <w:rFonts w:ascii="Times New Roman" w:hAnsi="Times New Roman" w:eastAsia="宋体"/>
+          <w:sz w:val="22"/>
+          <w:color w:val="000000"/>
+        </w:rPr>
+        <w:t xml:space="preserve"> Artstein, R., and Poesio, M. 2008. Inter-Coder Agreement for Computational Linguistics. Computational Linguistics 34(4):555–596. </w:t>
+      </w:r>
+      <w:hyperlink r:id="rId20">
+        <w:r>
+          <w:rPr>
+            <w:rFonts w:ascii="Times New Roman" w:hAnsi="Times New Roman" w:eastAsia="宋体"/>
+            <w:sz w:val="22"/>
+            <w:color w:val="0563C1"/>
+            <w:u w:val="single"/>
+          </w:rPr>
+          <w:t xml:space="preserve">https://aclanthology.org/J08-4004/</w:t>
+        </w:r>
+      </w:hyperlink>
       <w:bookmarkEnd w:id="191"/>
     </w:p>
     <w:p>
       <w:pPr>
-        <w:rPr>
-          <w:rFonts w:ascii="Times New Roman" w:hAnsi="Times New Roman" w:cs="Times New Roman"/>
-        </w:rPr>
+        <w:spacing w:before="0" w:after="120" w:line="276" w:lineRule="auto"/>
       </w:pPr>
       <w:bookmarkStart w:id="192" w:name="ref_Kr95"/>
       <w:r>
         <w:rPr>
-          <w:rFonts w:ascii="Times New Roman" w:hAnsi="Times New Roman" w:cs="Times New Roman"/>
-        </w:rPr>
-        <w:t xml:space="preserve">9. </w:t>
-      </w:r>
-      <w:r>
-        <w:rPr>
-          <w:rFonts w:ascii="Times New Roman" w:hAnsi="Times New Roman" w:cs="Times New Roman"/>
+          <w:rFonts w:ascii="Times New Roman" w:hAnsi="Times New Roman" w:eastAsia="宋体"/>
+          <w:sz w:val="22"/>
           <w:b/>
-        </w:rPr>
-        <w:t>[Kr95]</w:t>
-      </w:r>
-      <w:r>
-        <w:rPr>
-          <w:rFonts w:ascii="Times New Roman" w:hAnsi="Times New Roman" w:cs="Times New Roman"/>
-        </w:rPr>
-        <w:t xml:space="preserve"> Krippendorff, K. 1995. On the reliability of unitizing contiguous data. </w:t>
-      </w:r>
-      <w:r>
-        <w:rPr>
-          <w:rFonts w:ascii="Times New Roman" w:hAnsi="Times New Roman" w:cs="Times New Roman"/>
-          <w:i/>
-        </w:rPr>
-        <w:t>Sociological Methodology</w:t>
-      </w:r>
-      <w:r>
-        <w:rPr>
-          <w:rFonts w:ascii="Times New Roman" w:hAnsi="Times New Roman" w:cs="Times New Roman"/>
-        </w:rPr>
-        <w:t xml:space="preserve"> 25:47–76.</w:t>
-      </w:r>
+          <w:color w:val="000000"/>
+        </w:rPr>
+        <w:t xml:space="preserve">9. [Kr95]</w:t>
+      </w:r>
+      <w:r>
+        <w:rPr>
+          <w:rFonts w:ascii="Times New Roman" w:hAnsi="Times New Roman" w:eastAsia="宋体"/>
+          <w:sz w:val="22"/>
+          <w:color w:val="000000"/>
+        </w:rPr>
+        <w:t xml:space="preserve"> Krippendorff, K. 1995. On the reliability of unitizing continuous data. Sociological Methodology 25:47–76. </w:t>
+      </w:r>
+      <w:hyperlink r:id="rId21">
+        <w:r>
+          <w:rPr>
+            <w:rFonts w:ascii="Times New Roman" w:hAnsi="Times New Roman" w:eastAsia="宋体"/>
+            <w:sz w:val="22"/>
+            <w:color w:val="0563C1"/>
+            <w:u w:val="single"/>
+          </w:rPr>
+          <w:t xml:space="preserve">https://doi.org/10.2307/271061</w:t>
+        </w:r>
+      </w:hyperlink>
       <w:bookmarkEnd w:id="192"/>
     </w:p>
     <w:p>
       <w:pPr>
-        <w:rPr>
-          <w:rFonts w:ascii="Times New Roman" w:hAnsi="Times New Roman" w:cs="Times New Roman"/>
-        </w:rPr>
+        <w:spacing w:before="0" w:after="120" w:line="276" w:lineRule="auto"/>
       </w:pPr>
       <w:bookmarkStart w:id="193" w:name="ref_TKS02"/>
       <w:r>
         <w:rPr>
-          <w:rFonts w:ascii="Times New Roman" w:hAnsi="Times New Roman" w:cs="Times New Roman"/>
-        </w:rPr>
-        <w:t xml:space="preserve">10. </w:t>
-      </w:r>
-      <w:r>
-        <w:rPr>
-          <w:rFonts w:ascii="Times New Roman" w:hAnsi="Times New Roman" w:cs="Times New Roman"/>
+          <w:rFonts w:ascii="Times New Roman" w:hAnsi="Times New Roman" w:eastAsia="宋体"/>
+          <w:sz w:val="22"/>
           <w:b/>
-        </w:rPr>
-        <w:t>[TKS02]</w:t>
-      </w:r>
-      <w:r>
-        <w:rPr>
-          <w:rFonts w:ascii="Times New Roman" w:hAnsi="Times New Roman" w:cs="Times New Roman"/>
-        </w:rPr>
-        <w:t xml:space="preserve"> Tjong Kim Sang, E. F. 2002. Introduction to the CoNLL-2002 Shared Task: Language-Independent Named Entity Recognition. In </w:t>
-      </w:r>
-      <w:r>
-        <w:rPr>
-          <w:rFonts w:ascii="Times New Roman" w:hAnsi="Times New Roman" w:cs="Times New Roman"/>
-          <w:i/>
-        </w:rPr>
-        <w:t>CoNLL</w:t>
-      </w:r>
-      <w:r>
-        <w:rPr>
-          <w:rFonts w:ascii="Times New Roman" w:hAnsi="Times New Roman" w:cs="Times New Roman"/>
-        </w:rPr>
-        <w:t>. https://aclanthology.org/W02-2024/</w:t>
-      </w:r>
+          <w:color w:val="000000"/>
+        </w:rPr>
+        <w:t xml:space="preserve">10. [TKS02]</w:t>
+      </w:r>
+      <w:r>
+        <w:rPr>
+          <w:rFonts w:ascii="Times New Roman" w:hAnsi="Times New Roman" w:eastAsia="宋体"/>
+          <w:sz w:val="22"/>
+          <w:color w:val="000000"/>
+        </w:rPr>
+        <w:t xml:space="preserve"> Tjong Kim Sang, E. F. 2002. Introduction to the CoNLL-2002 Shared Task: Language-Independent Named Entity Recognition. In CoNLL. </w:t>
+      </w:r>
+      <w:hyperlink r:id="rId22">
+        <w:r>
+          <w:rPr>
+            <w:rFonts w:ascii="Times New Roman" w:hAnsi="Times New Roman" w:eastAsia="宋体"/>
+            <w:sz w:val="22"/>
+            <w:color w:val="0563C1"/>
+            <w:u w:val="single"/>
+          </w:rPr>
+          <w:t xml:space="preserve">https://aclanthology.org/W02-2024/</w:t>
+        </w:r>
+      </w:hyperlink>
       <w:bookmarkEnd w:id="193"/>
     </w:p>
     <w:p>
       <w:pPr>
-        <w:rPr>
-          <w:rFonts w:ascii="Times New Roman" w:hAnsi="Times New Roman" w:cs="Times New Roman"/>
-        </w:rPr>
+        <w:spacing w:before="0" w:after="120" w:line="276" w:lineRule="auto"/>
       </w:pPr>
       <w:bookmarkStart w:id="194" w:name="ref_FM09"/>
       <w:r>
         <w:rPr>
-          <w:rFonts w:ascii="Times New Roman" w:hAnsi="Times New Roman" w:cs="Times New Roman"/>
-        </w:rPr>
-        <w:t xml:space="preserve">11. </w:t>
-      </w:r>
-      <w:r>
-        <w:rPr>
-          <w:rFonts w:ascii="Times New Roman" w:hAnsi="Times New Roman" w:cs="Times New Roman"/>
+          <w:rFonts w:ascii="Times New Roman" w:hAnsi="Times New Roman" w:eastAsia="宋体"/>
+          <w:sz w:val="22"/>
           <w:b/>
-        </w:rPr>
-        <w:t>[FM09]</w:t>
-      </w:r>
-      <w:r>
-        <w:rPr>
-          <w:rFonts w:ascii="Times New Roman" w:hAnsi="Times New Roman" w:cs="Times New Roman"/>
-        </w:rPr>
-        <w:t xml:space="preserve"> Finkel, J. R., and Manning, C. D. 2009. Nested Named Entity Recognition. In </w:t>
-      </w:r>
-      <w:r>
-        <w:rPr>
-          <w:rFonts w:ascii="Times New Roman" w:hAnsi="Times New Roman" w:cs="Times New Roman"/>
-          <w:i/>
-        </w:rPr>
-        <w:t>EMNLP</w:t>
-      </w:r>
-      <w:r>
-        <w:rPr>
-          <w:rFonts w:ascii="Times New Roman" w:hAnsi="Times New Roman" w:cs="Times New Roman"/>
-        </w:rPr>
-        <w:t>, 141–150. https://aclanthology.org/D09-1015/</w:t>
-      </w:r>
+          <w:color w:val="000000"/>
+        </w:rPr>
+        <w:t xml:space="preserve">11. [FM09]</w:t>
+      </w:r>
+      <w:r>
+        <w:rPr>
+          <w:rFonts w:ascii="Times New Roman" w:hAnsi="Times New Roman" w:eastAsia="宋体"/>
+          <w:sz w:val="22"/>
+          <w:color w:val="000000"/>
+        </w:rPr>
+        <w:t xml:space="preserve"> Finkel, J. R., and Manning, C. D. 2009. Nested Named Entity Recognition. In EMNLP, 141–150. </w:t>
+      </w:r>
+      <w:hyperlink r:id="rId23">
+        <w:r>
+          <w:rPr>
+            <w:rFonts w:ascii="Times New Roman" w:hAnsi="Times New Roman" w:eastAsia="宋体"/>
+            <w:sz w:val="22"/>
+            <w:color w:val="0563C1"/>
+            <w:u w:val="single"/>
+          </w:rPr>
+          <w:t xml:space="preserve">https://aclanthology.org/D09-1015/</w:t>
+        </w:r>
+      </w:hyperlink>
       <w:bookmarkEnd w:id="194"/>
     </w:p>
     <w:p>
       <w:pPr>
-        <w:rPr>
-          <w:rFonts w:ascii="Times New Roman" w:hAnsi="Times New Roman" w:cs="Times New Roman"/>
-        </w:rPr>
+        <w:spacing w:before="0" w:after="120" w:line="276" w:lineRule="auto"/>
       </w:pPr>
       <w:bookmarkStart w:id="195" w:name="ref_Yu20"/>
       <w:r>
         <w:rPr>
-          <w:rFonts w:ascii="Times New Roman" w:hAnsi="Times New Roman" w:cs="Times New Roman"/>
-        </w:rPr>
-        <w:t xml:space="preserve">12. </w:t>
-      </w:r>
-      <w:r>
-        <w:rPr>
-          <w:rFonts w:ascii="Times New Roman" w:hAnsi="Times New Roman" w:cs="Times New Roman"/>
+          <w:rFonts w:ascii="Times New Roman" w:hAnsi="Times New Roman" w:eastAsia="宋体"/>
+          <w:sz w:val="22"/>
           <w:b/>
-        </w:rPr>
-        <w:t>[Yu20]</w:t>
-      </w:r>
-      <w:r>
-        <w:rPr>
-          <w:rFonts w:ascii="Times New Roman" w:hAnsi="Times New Roman" w:cs="Times New Roman"/>
-        </w:rPr>
-        <w:t xml:space="preserve"> Yu, J., Bohnet, B., and Poesio, M. 2020. Named Entity Recognition as Dependency Parsing. In </w:t>
-      </w:r>
-      <w:r>
-        <w:rPr>
-          <w:rFonts w:ascii="Times New Roman" w:hAnsi="Times New Roman" w:cs="Times New Roman"/>
-          <w:i/>
-        </w:rPr>
-        <w:t>ACL</w:t>
-      </w:r>
-      <w:r>
-        <w:rPr>
-          <w:rFonts w:ascii="Times New Roman" w:hAnsi="Times New Roman" w:cs="Times New Roman"/>
-        </w:rPr>
-        <w:t>, 6470–6476. https://aclanthology.org/2020.acl-main.577/</w:t>
-      </w:r>
+          <w:color w:val="000000"/>
+        </w:rPr>
+        <w:t xml:space="preserve">12. [Yu20]</w:t>
+      </w:r>
+      <w:r>
+        <w:rPr>
+          <w:rFonts w:ascii="Times New Roman" w:hAnsi="Times New Roman" w:eastAsia="宋体"/>
+          <w:sz w:val="22"/>
+          <w:color w:val="000000"/>
+        </w:rPr>
+        <w:t xml:space="preserve"> Yu, J., Bohnet, B., and Poesio, M. 2020. Named Entity Recognition as Dependency Parsing. In ACL, 6470–6476. </w:t>
+      </w:r>
+      <w:hyperlink r:id="rId24">
+        <w:r>
+          <w:rPr>
+            <w:rFonts w:ascii="Times New Roman" w:hAnsi="Times New Roman" w:eastAsia="宋体"/>
+            <w:sz w:val="22"/>
+            <w:color w:val="0563C1"/>
+            <w:u w:val="single"/>
+          </w:rPr>
+          <w:t xml:space="preserve">https://aclanthology.org/2020.acl-main.577/</w:t>
+        </w:r>
+      </w:hyperlink>
       <w:bookmarkEnd w:id="195"/>
     </w:p>
     <w:p>
       <w:pPr>
-        <w:rPr>
-          <w:rFonts w:ascii="Times New Roman" w:hAnsi="Times New Roman" w:cs="Times New Roman"/>
-        </w:rPr>
+        <w:spacing w:before="0" w:after="120" w:line="276" w:lineRule="auto"/>
       </w:pPr>
       <w:bookmarkStart w:id="196" w:name="ref_UD20"/>
       <w:r>
         <w:rPr>
-          <w:rFonts w:ascii="Times New Roman" w:hAnsi="Times New Roman" w:cs="Times New Roman"/>
-        </w:rPr>
-        <w:t xml:space="preserve">13. </w:t>
-      </w:r>
-      <w:r>
-        <w:rPr>
-          <w:rFonts w:ascii="Times New Roman" w:hAnsi="Times New Roman" w:cs="Times New Roman"/>
+          <w:rFonts w:ascii="Times New Roman" w:hAnsi="Times New Roman" w:eastAsia="宋体"/>
+          <w:sz w:val="22"/>
           <w:b/>
-        </w:rPr>
-        <w:t>[UD20]</w:t>
-      </w:r>
-      <w:r>
-        <w:rPr>
-          <w:rFonts w:ascii="Times New Roman" w:hAnsi="Times New Roman" w:cs="Times New Roman"/>
-        </w:rPr>
-        <w:t xml:space="preserve"> Nivre, J., de Marneffe, M.-C., Ginter, F., Hajič, J., Manning, C. D., Pyysalo, S., Schuster, S., Tyers, F., and Zeman, D. 2020. Universal Dependencies v2: An Evergrowing Multilingual Treebank Collection. In </w:t>
-      </w:r>
-      <w:r>
-        <w:rPr>
-          <w:rFonts w:ascii="Times New Roman" w:hAnsi="Times New Roman" w:cs="Times New Roman"/>
-          <w:i/>
-        </w:rPr>
-        <w:t>LREC</w:t>
-      </w:r>
-      <w:r>
-        <w:rPr>
-          <w:rFonts w:ascii="Times New Roman" w:hAnsi="Times New Roman" w:cs="Times New Roman"/>
-        </w:rPr>
-        <w:t>, 4034–4043. https://aclanthology.org/2020.lrec-1.497/ ；</w:t>
-      </w:r>
-      <w:r>
-        <w:t>中文省略：</w:t>
-      </w:r>
-      <w:r>
-        <w:rPr>
-          <w:rFonts w:ascii="Times New Roman" w:hAnsi="Times New Roman" w:cs="Times New Roman"/>
-        </w:rPr>
-        <w:t>https://universaldependencies.org/zh/dep/orphan.html</w:t>
-      </w:r>
+          <w:color w:val="000000"/>
+        </w:rPr>
+        <w:t xml:space="preserve">13. [UD20]</w:t>
+      </w:r>
+      <w:r>
+        <w:rPr>
+          <w:rFonts w:ascii="Times New Roman" w:hAnsi="Times New Roman" w:eastAsia="宋体"/>
+          <w:sz w:val="22"/>
+          <w:color w:val="000000"/>
+        </w:rPr>
+        <w:t xml:space="preserve"> Nivre, J., de Marneffe, M.-C., Ginter, F., Hajič, J., Manning, C. D., Pyysalo, S., Schuster, S., Tyers, F., and Zeman, D. 2020. Universal Dependencies v2: An Evergrowing Multilingual Treebank Collection. In LREC, 4034–4043. </w:t>
+      </w:r>
+      <w:hyperlink r:id="rId25">
+        <w:r>
+          <w:rPr>
+            <w:rFonts w:ascii="Times New Roman" w:hAnsi="Times New Roman" w:eastAsia="宋体"/>
+            <w:sz w:val="22"/>
+            <w:color w:val="0563C1"/>
+            <w:u w:val="single"/>
+          </w:rPr>
+          <w:t xml:space="preserve">https://aclanthology.org/2020.lrec-1.497/</w:t>
+        </w:r>
+      </w:hyperlink>
+      <w:r>
+        <w:rPr>
+          <w:rFonts w:ascii="Times New Roman" w:hAnsi="Times New Roman" w:eastAsia="宋体"/>
+          <w:sz w:val="22"/>
+          <w:color w:val="000000"/>
+        </w:rPr>
+        <w:t xml:space="preserve"> ；中文省略：</w:t>
+      </w:r>
+      <w:hyperlink r:id="rId26">
+        <w:r>
+          <w:rPr>
+            <w:rFonts w:ascii="Times New Roman" w:hAnsi="Times New Roman" w:eastAsia="宋体"/>
+            <w:sz w:val="22"/>
+            <w:color w:val="0563C1"/>
+            <w:u w:val="single"/>
+          </w:rPr>
+          <w:t xml:space="preserve">https://universaldependencies.org/zh/dep/orphan.html</w:t>
+        </w:r>
+      </w:hyperlink>
       <w:bookmarkEnd w:id="196"/>
     </w:p>
     <w:p>
       <w:pPr>
-        <w:rPr>
-          <w:rFonts w:ascii="Times New Roman" w:hAnsi="Times New Roman" w:cs="Times New Roman"/>
-        </w:rPr>
+        <w:spacing w:before="0" w:after="120" w:line="276" w:lineRule="auto"/>
       </w:pPr>
       <w:bookmarkStart w:id="197" w:name="ref_D18"/>
       <w:r>
         <w:rPr>
-          <w:rFonts w:ascii="Times New Roman" w:hAnsi="Times New Roman" w:cs="Times New Roman"/>
-        </w:rPr>
-        <w:t xml:space="preserve">14. </w:t>
-      </w:r>
-      <w:r>
-        <w:rPr>
-          <w:rFonts w:ascii="Times New Roman" w:hAnsi="Times New Roman" w:cs="Times New Roman"/>
+          <w:rFonts w:ascii="Times New Roman" w:hAnsi="Times New Roman" w:eastAsia="宋体"/>
+          <w:sz w:val="22"/>
           <w:b/>
-        </w:rPr>
-        <w:t>[D18]</w:t>
-      </w:r>
-      <w:r>
-        <w:rPr>
-          <w:rFonts w:ascii="Times New Roman" w:hAnsi="Times New Roman" w:cs="Times New Roman"/>
-        </w:rPr>
-        <w:t xml:space="preserve"> Nakayama, H., Kubo, T., Kamura, J., Taniguchi, Y., and Liang, X. 2018. doccano. https://github.com/doccano/doccano</w:t>
-      </w:r>
+          <w:color w:val="000000"/>
+        </w:rPr>
+        <w:t xml:space="preserve">14. [D18]</w:t>
+      </w:r>
+      <w:r>
+        <w:rPr>
+          <w:rFonts w:ascii="Times New Roman" w:hAnsi="Times New Roman" w:eastAsia="宋体"/>
+          <w:sz w:val="22"/>
+          <w:color w:val="000000"/>
+        </w:rPr>
+        <w:t xml:space="preserve"> Nakayama, H., Kubo, T., Kamura, J., Taniguchi, Y., and Liang, X. 2018. doccano: Text Annotation Tool for Human. [Software]. </w:t>
+      </w:r>
+      <w:hyperlink r:id="rId27">
+        <w:r>
+          <w:rPr>
+            <w:rFonts w:ascii="Times New Roman" w:hAnsi="Times New Roman" w:eastAsia="宋体"/>
+            <w:sz w:val="22"/>
+            <w:color w:val="0563C1"/>
+            <w:u w:val="single"/>
+          </w:rPr>
+          <w:t xml:space="preserve">https://github.com/doccano/doccano#citation</w:t>
+        </w:r>
+      </w:hyperlink>
       <w:bookmarkEnd w:id="197"/>
     </w:p>
     <w:p>
       <w:pPr>
-        <w:rPr>
-          <w:rFonts w:ascii="Times New Roman" w:hAnsi="Times New Roman" w:cs="Times New Roman"/>
-        </w:rPr>
+        <w:spacing w:before="0" w:after="120" w:line="276" w:lineRule="auto"/>
       </w:pPr>
       <w:bookmarkStart w:id="198" w:name="ref_ONET"/>
       <w:r>
-        <w:t>15. [ONET] Peterson, N. G., Mumford, M. D., Borman, W. C., Jeanneret, P. R., Fleishman, E. A., Levin, K. Y., Campion, M. A., Mayfield, M. S., Morgeson, F. P., Pearlman, K., Gowing, M. K., Lancaster, A. R., Silver, M. B., and Dye, D. M. 2001. Understanding Work Using the Occupational Information Network (ONET). Personnel Psychology 54(2):451–477.</w:t>
-      </w:r>
+        <w:rPr>
+          <w:rFonts w:ascii="Times New Roman" w:hAnsi="Times New Roman" w:eastAsia="宋体"/>
+          <w:sz w:val="22"/>
+          <w:b/>
+          <w:color w:val="000000"/>
+        </w:rPr>
+        <w:t xml:space="preserve">15. [ONET]</w:t>
+      </w:r>
+      <w:r>
+        <w:rPr>
+          <w:rFonts w:ascii="Times New Roman" w:hAnsi="Times New Roman" w:eastAsia="宋体"/>
+          <w:sz w:val="22"/>
+          <w:color w:val="000000"/>
+        </w:rPr>
+        <w:t xml:space="preserve"> Peterson, N. G., Mumford, M. D., Borman, W. C., Jeanneret, P. R., Fleishman, E. A., Levin, K. Y., Campion, M. A., Mayfield, M. S., Morgeson, F. P., Pearlman, K., Gowing, M. K., Lancaster, A. R., Silver, M. B., and Dye, D. M. 2001. Understanding Work Using the Occupational Information Network (O*NET): Implications for Practice and Research. Personnel Psychology 54(2):451–492. </w:t>
+      </w:r>
+      <w:hyperlink r:id="rId28">
+        <w:r>
+          <w:rPr>
+            <w:rFonts w:ascii="Times New Roman" w:hAnsi="Times New Roman" w:eastAsia="宋体"/>
+            <w:sz w:val="22"/>
+            <w:color w:val="0563C1"/>
+            <w:u w:val="single"/>
+          </w:rPr>
+          <w:t xml:space="preserve">https://doi.org/10.1111/j.1744-6570.2001.tb00100.x</w:t>
+        </w:r>
+      </w:hyperlink>
       <w:bookmarkEnd w:id="198"/>
     </w:p>
     <w:p>
       <w:pPr>
-        <w:rPr>
-          <w:rFonts w:ascii="Times New Roman" w:hAnsi="Times New Roman" w:cs="Times New Roman"/>
-        </w:rPr>
+        <w:spacing w:before="0" w:after="120" w:line="276" w:lineRule="auto"/>
       </w:pPr>
       <w:bookmarkStart w:id="199" w:name="ref_Nav09"/>
       <w:r>
         <w:rPr>
-          <w:rFonts w:ascii="Times New Roman" w:hAnsi="Times New Roman" w:cs="Times New Roman"/>
-        </w:rPr>
-        <w:t xml:space="preserve">16. </w:t>
-      </w:r>
-      <w:r>
-        <w:rPr>
-          <w:rFonts w:ascii="Times New Roman" w:hAnsi="Times New Roman" w:cs="Times New Roman"/>
+          <w:rFonts w:ascii="Times New Roman" w:hAnsi="Times New Roman" w:eastAsia="宋体"/>
+          <w:sz w:val="22"/>
           <w:b/>
-        </w:rPr>
-        <w:t>[Nav09]</w:t>
-      </w:r>
-      <w:r>
-        <w:rPr>
-          <w:rFonts w:ascii="Times New Roman" w:hAnsi="Times New Roman" w:cs="Times New Roman"/>
-        </w:rPr>
-        <w:t xml:space="preserve"> Navigli, R. 2009. Word Sense Disambiguation: A Survey. </w:t>
-      </w:r>
-      <w:r>
-        <w:rPr>
-          <w:rFonts w:ascii="Times New Roman" w:hAnsi="Times New Roman" w:cs="Times New Roman"/>
-          <w:i/>
-        </w:rPr>
-        <w:t>ACM Computing Surveys</w:t>
-      </w:r>
-      <w:r>
-        <w:rPr>
-          <w:rFonts w:ascii="Times New Roman" w:hAnsi="Times New Roman" w:cs="Times New Roman"/>
-        </w:rPr>
-        <w:t xml:space="preserve"> 41(2):1–69.</w:t>
-      </w:r>
+          <w:color w:val="000000"/>
+        </w:rPr>
+        <w:t xml:space="preserve">16. [Nav09]</w:t>
+      </w:r>
+      <w:r>
+        <w:rPr>
+          <w:rFonts w:ascii="Times New Roman" w:hAnsi="Times New Roman" w:eastAsia="宋体"/>
+          <w:sz w:val="22"/>
+          <w:color w:val="000000"/>
+        </w:rPr>
+        <w:t xml:space="preserve"> Navigli, R. 2009. Word Sense Disambiguation: A Survey. ACM Computing Surveys 41(2), Article 10, 1–69. </w:t>
+      </w:r>
+      <w:hyperlink r:id="rId29">
+        <w:r>
+          <w:rPr>
+            <w:rFonts w:ascii="Times New Roman" w:hAnsi="Times New Roman" w:eastAsia="宋体"/>
+            <w:sz w:val="22"/>
+            <w:color w:val="0563C1"/>
+            <w:u w:val="single"/>
+          </w:rPr>
+          <w:t xml:space="preserve">https://doi.org/10.1145/1459352.1459355</w:t>
+        </w:r>
+      </w:hyperlink>
       <w:bookmarkEnd w:id="199"/>
     </w:p>
     <w:p>
       <w:pPr>
-        <w:rPr>
-          <w:rFonts w:ascii="Times New Roman" w:hAnsi="Times New Roman" w:cs="Times New Roman"/>
-        </w:rPr>
+        <w:spacing w:before="0" w:after="120" w:line="276" w:lineRule="auto"/>
       </w:pPr>
       <w:bookmarkStart w:id="200" w:name="ref_PB05"/>
       <w:r>
         <w:rPr>
-          <w:rFonts w:ascii="Times New Roman" w:hAnsi="Times New Roman" w:cs="Times New Roman"/>
-        </w:rPr>
-        <w:t xml:space="preserve">17. </w:t>
-      </w:r>
-      <w:r>
-        <w:rPr>
-          <w:rFonts w:ascii="Times New Roman" w:hAnsi="Times New Roman" w:cs="Times New Roman"/>
+          <w:rFonts w:ascii="Times New Roman" w:hAnsi="Times New Roman" w:eastAsia="宋体"/>
+          <w:sz w:val="22"/>
           <w:b/>
-        </w:rPr>
-        <w:t>[PB05]</w:t>
-      </w:r>
-      <w:r>
-        <w:rPr>
-          <w:rFonts w:ascii="Times New Roman" w:hAnsi="Times New Roman" w:cs="Times New Roman"/>
-        </w:rPr>
-        <w:t xml:space="preserve"> Palmer, M., Gildea, D., and Kingsbury, P. 2005. The Proposition Bank: An Annotated Corpus of Semantic Roles. </w:t>
-      </w:r>
-      <w:r>
-        <w:rPr>
-          <w:rFonts w:ascii="Times New Roman" w:hAnsi="Times New Roman" w:cs="Times New Roman"/>
-          <w:i/>
-        </w:rPr>
-        <w:t>Computational Linguistics</w:t>
-      </w:r>
-      <w:r>
-        <w:rPr>
-          <w:rFonts w:ascii="Times New Roman" w:hAnsi="Times New Roman" w:cs="Times New Roman"/>
-        </w:rPr>
-        <w:t xml:space="preserve"> 31(1):71–106.</w:t>
-      </w:r>
+          <w:color w:val="000000"/>
+        </w:rPr>
+        <w:t xml:space="preserve">17. [PB05]</w:t>
+      </w:r>
+      <w:r>
+        <w:rPr>
+          <w:rFonts w:ascii="Times New Roman" w:hAnsi="Times New Roman" w:eastAsia="宋体"/>
+          <w:sz w:val="22"/>
+          <w:color w:val="000000"/>
+        </w:rPr>
+        <w:t xml:space="preserve"> Palmer, M., Gildea, D., and Kingsbury, P. 2005. The Proposition Bank: An Annotated Corpus of Semantic Roles. Computational Linguistics 31(1):71–106. </w:t>
+      </w:r>
+      <w:hyperlink r:id="rId30">
+        <w:r>
+          <w:rPr>
+            <w:rFonts w:ascii="Times New Roman" w:hAnsi="Times New Roman" w:eastAsia="宋体"/>
+            <w:sz w:val="22"/>
+            <w:color w:val="0563C1"/>
+            <w:u w:val="single"/>
+          </w:rPr>
+          <w:t xml:space="preserve">https://aclanthology.org/J05-1004/</w:t>
+        </w:r>
+      </w:hyperlink>
       <w:bookmarkEnd w:id="200"/>
     </w:p>
     <w:p>
+      <w:pPr>
+        <w:spacing w:before="0" w:after="120" w:line="276" w:lineRule="auto"/>
+      </w:pPr>
       <w:bookmarkStart w:id="201" w:name="ref_LK77"/>
       <w:r>
-        <w:t>18. [LK77] Landis, J. R., and Koch, G. G. 1977. The Measurement of Observer Agreement for Categorical Data. Biometrics 33(1):159–174。用于理解一致性指标；一致性高本身不证明标签正确。</w:t>
-      </w:r>
+        <w:rPr>
+          <w:rFonts w:ascii="Times New Roman" w:hAnsi="Times New Roman" w:eastAsia="宋体"/>
+          <w:sz w:val="22"/>
+          <w:b/>
+          <w:color w:val="000000"/>
+        </w:rPr>
+        <w:t xml:space="preserve">18. [LK77]</w:t>
+      </w:r>
+      <w:r>
+        <w:rPr>
+          <w:rFonts w:ascii="Times New Roman" w:hAnsi="Times New Roman" w:eastAsia="宋体"/>
+          <w:sz w:val="22"/>
+          <w:color w:val="000000"/>
+        </w:rPr>
+        <w:t xml:space="preserve"> Landis, J. R., and Koch, G. G. 1977. The Measurement of Observer Agreement for Categorical Data. Biometrics 33(1):159–174。用于理解一致性指标；一致性高本身不证明标签正确。 </w:t>
+      </w:r>
+      <w:hyperlink r:id="rId31">
+        <w:r>
+          <w:rPr>
+            <w:rFonts w:ascii="Times New Roman" w:hAnsi="Times New Roman" w:eastAsia="宋体"/>
+            <w:sz w:val="22"/>
+            <w:color w:val="0563C1"/>
+            <w:u w:val="single"/>
+          </w:rPr>
+          <w:t xml:space="preserve">https://pubmed.ncbi.nlm.nih.gov/843571/</w:t>
+        </w:r>
+      </w:hyperlink>
       <w:bookmarkEnd w:id="201"/>
     </w:p>
     <w:p>
+      <w:pPr>
+        <w:spacing w:before="0" w:after="120" w:line="276" w:lineRule="auto"/>
+      </w:pPr>
       <w:bookmarkStart w:id="202" w:name="ref_ESCO_C"/>
       <w:r>
-        <w:t>19. [ESCO-C] European Commission. ESCO: Competence. https://esco.ec.europa.eu/en/about-esco/escopedia/escopedia/competence</w:t>
-      </w:r>
+        <w:rPr>
+          <w:rFonts w:ascii="Times New Roman" w:hAnsi="Times New Roman" w:eastAsia="宋体"/>
+          <w:sz w:val="22"/>
+          <w:b/>
+          <w:color w:val="000000"/>
+        </w:rPr>
+        <w:t xml:space="preserve">19. [ESCO-C]</w:t>
+      </w:r>
+      <w:r>
+        <w:rPr>
+          <w:rFonts w:ascii="Times New Roman" w:hAnsi="Times New Roman" w:eastAsia="宋体"/>
+          <w:sz w:val="22"/>
+          <w:color w:val="000000"/>
+        </w:rPr>
+        <w:t xml:space="preserve"> European Commission. ESCO: Competence. </w:t>
+      </w:r>
+      <w:hyperlink r:id="rId32">
+        <w:r>
+          <w:rPr>
+            <w:rFonts w:ascii="Times New Roman" w:hAnsi="Times New Roman" w:eastAsia="宋体"/>
+            <w:sz w:val="22"/>
+            <w:color w:val="0563C1"/>
+            <w:u w:val="single"/>
+          </w:rPr>
+          <w:t xml:space="preserve">https://esco.ec.europa.eu/en/about-esco/escopedia/escopedia/competence</w:t>
+        </w:r>
+      </w:hyperlink>
       <w:bookmarkEnd w:id="202"/>
     </w:p>
     <w:p>
+      <w:pPr>
+        <w:spacing w:before="0" w:after="120" w:line="276" w:lineRule="auto"/>
+      </w:pPr>
       <w:bookmarkStart w:id="203" w:name="ref_ESCO_R"/>
       <w:r>
-        <w:t>20. [ESCO-R] European Commission. ESCO: Skill reusability level. https://esco.ec.europa.eu/en/about-esco/escopedia/escopedia/skill-reusability-level</w:t>
-      </w:r>
+        <w:rPr>
+          <w:rFonts w:ascii="Times New Roman" w:hAnsi="Times New Roman" w:eastAsia="宋体"/>
+          <w:sz w:val="22"/>
+          <w:b/>
+          <w:color w:val="000000"/>
+        </w:rPr>
+        <w:t xml:space="preserve">20. [ESCO-R]</w:t>
+      </w:r>
+      <w:r>
+        <w:rPr>
+          <w:rFonts w:ascii="Times New Roman" w:hAnsi="Times New Roman" w:eastAsia="宋体"/>
+          <w:sz w:val="22"/>
+          <w:color w:val="000000"/>
+        </w:rPr>
+        <w:t xml:space="preserve"> European Commission. ESCO: Skill reusability level. </w:t>
+      </w:r>
+      <w:hyperlink r:id="rId33">
+        <w:r>
+          <w:rPr>
+            <w:rFonts w:ascii="Times New Roman" w:hAnsi="Times New Roman" w:eastAsia="宋体"/>
+            <w:sz w:val="22"/>
+            <w:color w:val="0563C1"/>
+            <w:u w:val="single"/>
+          </w:rPr>
+          <w:t xml:space="preserve">https://esco.ec.europa.eu/en/about-esco/escopedia/escopedia/skill-reusability-level</w:t>
+        </w:r>
+      </w:hyperlink>
       <w:bookmarkEnd w:id="203"/>
-    </w:p>
-    <w:p>
-      <w:bookmarkStart w:id="204" w:name="ref_ESCO_TG"/>
-      <w:r>
-        <w:t>21. [ESCO-TG] ESCO expert group. Report of the expert group on transversal skills and competences, §5.3. https://esco.ec.europa.eu/system/files/2022-05/MSWG%2014-04%20Report%20of%20the%20expert%20group%20on%20transversal%20skills%20and%20competences.pdf</w:t>
-      </w:r>
-      <w:bookmarkEnd w:id="204"/>
     </w:p>
     <w:p>
       <w:pPr>

</xml_diff>

<commit_message>
Clarify handbook versions used in annotation and evaluation
</commit_message>
<xml_diff>
--- a/notes/handbooks/reader_20261007/Chinese_SkillSpan_中文版编码手册_20261007.docx
+++ b/notes/handbooks/reader_20261007/Chinese_SkillSpan_中文版编码手册_20261007.docx
@@ -52,7 +52,7 @@
           <w:rFonts w:ascii="Times New Roman" w:hAnsi="Times New Roman" w:cs="Times New Roman"/>
           <w:lang w:eastAsia="zh-CN"/>
         </w:rPr>
-        <w:t xml:space="preserve">规则底稿：B.sop_v4.2.14（2026-09-09）｜文档修订：2026-10-08｜中文整理版</w:t>
+        <w:t xml:space="preserve">规则底稿：B.sop_v4.2.14（2026-09-09）｜文档修订：2026-10-09｜中文整理版</w:t>
       </w:r>
       <w:r>
         <w:rPr>
@@ -51986,9 +51986,18 @@
       </w:pPr>
       <w:r>
         <w:rPr>
+          <w:lang w:eastAsia="zh-CN"/>
           <w:woUserID w:val="1"/>
         </w:rPr>
-        <w:t xml:space="preserve">PROMPT_silver_plus_v4211.txt与2351条批次所记的silver_plus_v4212_rev2属于不同历史记录，不能互相替换。各批次实际使用的手册、提示词、标签和评测协议仍须按存档文件对应核实。</w:t>
+        <w:t>历史版本按阶段区分：150条人工参考标签均记录v4.2.10，参考集操作文档记载v4.2.11；初始100条银标的提示词采用v4.2.10 rev1，后续编码与复核记录涉及v4.2.11；其余2351条原始银标的批量生成提示词采用v4.2.12 rev2。标签元数据与操作文件是不同证据，不能互相替代。</w:t>
+      </w:r>
+    </w:p>
+    <w:p>
+      <w:pPr>
+        <w:pStyle w:val="1"/>
+      </w:pPr>
+      <w:r>
+        <w:t xml:space="preserve">该版本台账共2451条；剩余29条经二次分类为3条确认空标和26条疑难或无法判断。保守过滤后的1424条是当时的训练候选母池，含难来源520条和易来源904条，尚待划出开发集。这些数量仅描述该数据版本；该次整理未启动训练，历史结果保持原值。</w:t>
       </w:r>
       <w:r>
         <w:rPr>
@@ -52001,12 +52010,34 @@
         <w:pStyle w:val="1"/>
       </w:pPr>
       <w:r>
-        <w:t xml:space="preserve">该版本台账共2451条；剩余29条经二次分类为3条确认空标和26条疑难或无法判断。保守过滤后的1424条是当时的训练候选母池，含难来源520条和易来源904条，尚待划出开发集。这些数量仅描述该数据版本；该次整理未启动训练，历史结果保持原值。</w:t>
-      </w:r>
+        <w:t xml:space="preserve">历史修订说明：v4.2.12整合了当时采用的复核结论，此前100条保留原模型调用记录。该次手册修订未新增训练或测试；其他P01—P10案例按各自状态管理。</w:t>
+      </w:r>
+    </w:p>
+    <w:p>
+      <w:pPr>
+        <w:pStyle w:val="1"/>
+      </w:pPr>
+      <w:r>
+        <w:t xml:space="preserve">B.sop_v4.2.14是规则系列名称，不表示此后各份Word内容完全相同。9月29日释义稿、9月30日读者稿、10月2日论文对齐稿及10月3日整合稿属于该系列的不同文档修订；10月6—7日的人工审阅稿是后续维护材料，不能据此证明早期标注使用了同一内容。</w:t>
+      </w:r>
+    </w:p>
+    <w:p>
+      <w:pPr>
+        <w:pStyle w:val="1"/>
+      </w:pPr>
+      <w:r>
+        <w:t>三人盲标研究的准备材料属于v4.2.14系列；各编码员正式编码和个人自查时使用的具体文件尚未确定，不能用当前阅读版代替。早期50句校准阶段是否提供机器建议，作者回忆与早期操作文件存在冲突，现有记录无法消除这一分歧；该阶段不作为盲标一致性研究。</w:t>
+      </w:r>
+    </w:p>
+    <w:p>
+      <w:pPr>
+        <w:pStyle w:val="1"/>
+      </w:pPr>
       <w:r>
         <w:rPr>
           <w:rStyle w:val="CommentReference"/>
         </w:rPr>
+        <w:t>论文中的生成式模型比较使用基于v4.2.12的共享指令和五个固定示例，与当前v4.2.14阅读版分别记录。复现时保留实际执行的提示词、文件版本及校验值，不据当前手册回写历史标签或实验记录。</w:t>
       </w:r>
     </w:p>
     <w:p>
@@ -52014,36 +52045,23 @@
         <w:pStyle w:val="1"/>
       </w:pPr>
       <w:r>
-        <w:t xml:space="preserve">历史修订说明：v4.2.12整合了当时采用的复核结论，此前100条保留原模型调用记录。该次手册修订未新增训练或测试；其他P01—P10案例按各自状态管理。</w:t>
-      </w:r>
-    </w:p>
-    <w:p>
-      <w:pPr>
-        <w:pStyle w:val="1"/>
-      </w:pPr>
-      <w:r>
-        <w:t xml:space="preserve">B.sop_v4.2.14是规则系列名称，不表示此后各份Word内容完全相同。9月29日释义稿、9月30日读者稿、10月2日论文对齐稿及10月3日整合稿属于该系列的不同文档修订；10月6—7日的人工审阅稿是后续维护材料，不能据此证明早期标注使用了同一内容。</w:t>
-      </w:r>
-    </w:p>
-    <w:p>
-      <w:pPr>
-        <w:pStyle w:val="1"/>
-      </w:pPr>
-      <w:r>
-        <w:t xml:space="preserve">根据作者补充，B.sop_v4.2.14系列用于后期人工参考标注、纠标及案例讨论中的模型辅助；具体批次与修订文件的对应关系仍待核实。这不表示早期批量标注也使用该系列。</w:t>
-      </w:r>
-    </w:p>
-    <w:p>
-      <w:pPr>
-        <w:pStyle w:val="1"/>
-      </w:pPr>
-      <w:r>
-        <w:t xml:space="preserve">材料获取：仓库入口见附录A“来源与维护”。本地快照、历史原文与标签、已完成复核记录的对应文件及可公开链接尚待核实；本稿不提供无法供外部读者访问的本地路径。</w:t>
-      </w:r>
-      <w:r>
         <w:rPr>
           <w:rStyle w:val="CommentReference"/>
         </w:rPr>
+        <w:t>材料获取：各阶段的版本证据见</w:t>
+      </w:r>
+      <w:hyperlink r:id="rId34">
+        <w:r>
+          <w:rPr>
+            <w:rStyle w:val="CommentReference"/>
+            <w:color w:val="0563C1"/>
+            <w:u w:val="single"/>
+          </w:rPr>
+          <w:t>标注阶段与手册记录</w:t>
+        </w:r>
+      </w:hyperlink>
+      <w:r>
+        <w:t>。其他配套材料的获取情况仍须逐项核实。</w:t>
       </w:r>
     </w:p>
     <w:p>

</xml_diff>